<commit_message>
CFA y .zip [2.2]
</commit_message>
<xml_diff>
--- a/fuentes/CF2_12210556_DU.docx
+++ b/fuentes/CF2_12210556_DU.docx
@@ -2282,6 +2282,8 @@
       <w:pPr>
         <w:ind w:firstLine="0"/>
         <w:rPr>
+          <w:b/>
+          <w:u w:val="single"/>
           <w:lang w:eastAsia="es-CO"/>
         </w:rPr>
       </w:pPr>
@@ -2294,6 +2296,8 @@
           <w:t>Enlace de reproducción del video</w:t>
         </w:r>
       </w:hyperlink>
+      <w:bookmarkStart w:id="3" w:name="_GoBack"/>
+      <w:bookmarkEnd w:id="3"/>
     </w:p>
     <w:tbl>
       <w:tblPr>
@@ -2311,7 +2315,7 @@
           </w:tcPr>
           <w:p>
             <w:pPr>
-              <w:jc w:val="center"/>
+              <w:ind w:firstLine="0"/>
               <w:rPr>
                 <w:b/>
               </w:rPr>
@@ -2320,7 +2324,13 @@
               <w:rPr>
                 <w:b/>
               </w:rPr>
-              <w:t xml:space="preserve">Síntesis del video: </w:t>
+              <w:t>Transcripción del video</w:t>
+            </w:r>
+            <w:r>
+              <w:rPr>
+                <w:b/>
+              </w:rPr>
+              <w:t xml:space="preserve">: </w:t>
             </w:r>
             <w:r>
               <w:t>Colaboración digital con Microsoft 365</w:t>
@@ -2948,12 +2958,12 @@
         <w:spacing w:after="120"/>
         <w:ind w:left="720"/>
       </w:pPr>
-      <w:bookmarkStart w:id="3" w:name="_Toc223942466"/>
+      <w:bookmarkStart w:id="4" w:name="_Toc223942466"/>
       <w:r>
         <w:lastRenderedPageBreak/>
         <w:t>Trabajo colaborativo en entornos digitales</w:t>
       </w:r>
-      <w:bookmarkEnd w:id="3"/>
+      <w:bookmarkEnd w:id="4"/>
     </w:p>
     <w:p>
       <w:pPr>
@@ -3656,12 +3666,12 @@
       <w:pPr>
         <w:pStyle w:val="Ttulo2"/>
       </w:pPr>
-      <w:bookmarkStart w:id="4" w:name="_Toc223942467"/>
+      <w:bookmarkStart w:id="5" w:name="_Toc223942467"/>
       <w:r>
         <w:lastRenderedPageBreak/>
         <w:t>Beneficios</w:t>
       </w:r>
-      <w:bookmarkEnd w:id="4"/>
+      <w:bookmarkEnd w:id="5"/>
     </w:p>
     <w:p>
       <w:pPr>
@@ -3679,10 +3689,7 @@
     <w:p>
       <w:pPr>
         <w:pStyle w:val="Prrafodelista"/>
-        <w:numPr>
-          <w:ilvl w:val="0"/>
-          <w:numId w:val="6"/>
-        </w:numPr>
+        <w:ind w:firstLine="0"/>
         <w:rPr>
           <w:lang w:eastAsia="es-CO"/>
         </w:rPr>
@@ -3901,12 +3908,12 @@
       <w:pPr>
         <w:pStyle w:val="Ttulo2"/>
       </w:pPr>
-      <w:bookmarkStart w:id="5" w:name="_Toc223942468"/>
+      <w:bookmarkStart w:id="6" w:name="_Toc223942468"/>
       <w:r>
         <w:lastRenderedPageBreak/>
         <w:t>Edición compartida de archivos en línea</w:t>
       </w:r>
-      <w:bookmarkEnd w:id="5"/>
+      <w:bookmarkEnd w:id="6"/>
     </w:p>
     <w:p>
       <w:pPr>
@@ -4750,11 +4757,11 @@
       <w:pPr>
         <w:pStyle w:val="Ttulo2"/>
       </w:pPr>
-      <w:bookmarkStart w:id="6" w:name="_Toc223942469"/>
+      <w:bookmarkStart w:id="7" w:name="_Toc223942469"/>
       <w:r>
         <w:t>Retos en las organizaciones</w:t>
       </w:r>
-      <w:bookmarkEnd w:id="6"/>
+      <w:bookmarkEnd w:id="7"/>
     </w:p>
     <w:p>
       <w:pPr>
@@ -5583,12 +5590,12 @@
         <w:spacing w:after="120"/>
         <w:ind w:left="720"/>
       </w:pPr>
-      <w:bookmarkStart w:id="7" w:name="_Toc223942470"/>
+      <w:bookmarkStart w:id="8" w:name="_Toc223942470"/>
       <w:r>
         <w:lastRenderedPageBreak/>
         <w:t>Teams</w:t>
       </w:r>
-      <w:bookmarkEnd w:id="7"/>
+      <w:bookmarkEnd w:id="8"/>
       <w:r>
         <w:t xml:space="preserve"> </w:t>
       </w:r>
@@ -6473,11 +6480,11 @@
       <w:pPr>
         <w:pStyle w:val="Ttulo2"/>
       </w:pPr>
-      <w:bookmarkStart w:id="8" w:name="_Toc223942471"/>
+      <w:bookmarkStart w:id="9" w:name="_Toc223942471"/>
       <w:r>
         <w:t>Reuniones en línea</w:t>
       </w:r>
-      <w:bookmarkEnd w:id="8"/>
+      <w:bookmarkEnd w:id="9"/>
     </w:p>
     <w:p>
       <w:pPr>
@@ -7414,11 +7421,11 @@
       <w:pPr>
         <w:pStyle w:val="Ttulo2"/>
       </w:pPr>
-      <w:bookmarkStart w:id="9" w:name="_Toc223942472"/>
+      <w:bookmarkStart w:id="10" w:name="_Toc223942472"/>
       <w:r>
         <w:t>Chat y videollamadas</w:t>
       </w:r>
-      <w:bookmarkEnd w:id="9"/>
+      <w:bookmarkEnd w:id="10"/>
     </w:p>
     <w:p>
       <w:pPr>
@@ -7509,11 +7516,11 @@
       <w:pPr>
         <w:pStyle w:val="Ttulo2"/>
       </w:pPr>
-      <w:bookmarkStart w:id="10" w:name="_Toc223942473"/>
+      <w:bookmarkStart w:id="11" w:name="_Toc223942473"/>
       <w:r>
         <w:t>Creación de equipos y canales</w:t>
       </w:r>
-      <w:bookmarkEnd w:id="10"/>
+      <w:bookmarkEnd w:id="11"/>
     </w:p>
     <w:p>
       <w:pPr>
@@ -8111,11 +8118,11 @@
       <w:pPr>
         <w:pStyle w:val="Ttulo2"/>
       </w:pPr>
-      <w:bookmarkStart w:id="11" w:name="_Toc223942474"/>
+      <w:bookmarkStart w:id="12" w:name="_Toc223942474"/>
       <w:r>
         <w:t>Integración con otras aplicaciones</w:t>
       </w:r>
-      <w:bookmarkEnd w:id="11"/>
+      <w:bookmarkEnd w:id="12"/>
     </w:p>
     <w:p>
       <w:pPr>
@@ -8293,6 +8300,90 @@
         </w:rPr>
         <w:t>Otras</w:t>
       </w:r>
+      <w:r>
+        <w:rPr>
+          <w:lang w:eastAsia="es-CO"/>
+        </w:rPr>
+        <w:tab/>
+      </w:r>
+      <w:r>
+        <w:rPr>
+          <w:lang w:eastAsia="es-CO"/>
+        </w:rPr>
+        <w:tab/>
+      </w:r>
+      <w:r>
+        <w:rPr>
+          <w:lang w:eastAsia="es-CO"/>
+        </w:rPr>
+        <w:tab/>
+      </w:r>
+      <w:r>
+        <w:rPr>
+          <w:lang w:eastAsia="es-CO"/>
+        </w:rPr>
+        <w:tab/>
+      </w:r>
+      <w:r>
+        <w:rPr>
+          <w:lang w:eastAsia="es-CO"/>
+        </w:rPr>
+        <w:tab/>
+      </w:r>
+      <w:r>
+        <w:rPr>
+          <w:lang w:eastAsia="es-CO"/>
+        </w:rPr>
+        <w:tab/>
+      </w:r>
+      <w:r>
+        <w:rPr>
+          <w:lang w:eastAsia="es-CO"/>
+        </w:rPr>
+        <w:tab/>
+      </w:r>
+      <w:r>
+        <w:rPr>
+          <w:lang w:eastAsia="es-CO"/>
+        </w:rPr>
+        <w:tab/>
+      </w:r>
+      <w:r>
+        <w:rPr>
+          <w:lang w:eastAsia="es-CO"/>
+        </w:rPr>
+        <w:tab/>
+      </w:r>
+      <w:r>
+        <w:rPr>
+          <w:lang w:eastAsia="es-CO"/>
+        </w:rPr>
+        <w:tab/>
+      </w:r>
+      <w:r>
+        <w:rPr>
+          <w:lang w:eastAsia="es-CO"/>
+        </w:rPr>
+        <w:tab/>
+      </w:r>
+      <w:r>
+        <w:rPr>
+          <w:lang w:eastAsia="es-CO"/>
+        </w:rPr>
+        <w:tab/>
+      </w:r>
+      <w:r>
+        <w:rPr>
+          <w:lang w:eastAsia="es-CO"/>
+        </w:rPr>
+        <w:tab/>
+      </w:r>
+      <w:r>
+        <w:rPr>
+          <w:lang w:eastAsia="es-CO"/>
+        </w:rPr>
+        <w:tab/>
+      </w:r>
     </w:p>
     <w:p>
       <w:pPr>
@@ -8311,6 +8402,7 @@
           <w:b/>
           <w:lang w:eastAsia="es-CO"/>
         </w:rPr>
+        <w:lastRenderedPageBreak/>
         <w:t>Aplicaciones externas:</w:t>
       </w:r>
     </w:p>
@@ -8330,7 +8422,6 @@
         <w:rPr>
           <w:lang w:eastAsia="es-CO"/>
         </w:rPr>
-        <w:lastRenderedPageBreak/>
         <w:t>Trello</w:t>
       </w:r>
       <w:proofErr w:type="spellEnd"/>
@@ -9212,16 +9303,6 @@
         </w:rPr>
       </w:pPr>
     </w:p>
-    <w:p>
-      <w:pPr>
-        <w:spacing w:before="0" w:after="0"/>
-        <w:ind w:firstLine="0"/>
-        <w:rPr>
-          <w:rStyle w:val="Hipervnculo"/>
-          <w:lang w:eastAsia="es-CO"/>
-        </w:rPr>
-      </w:pPr>
-    </w:p>
     <w:tbl>
       <w:tblPr>
         <w:tblStyle w:val="Tablaconcuadrcula"/>
@@ -9238,7 +9319,7 @@
           </w:tcPr>
           <w:p>
             <w:pPr>
-              <w:jc w:val="center"/>
+              <w:ind w:firstLine="0"/>
               <w:rPr>
                 <w:b/>
               </w:rPr>
@@ -9247,7 +9328,14 @@
               <w:rPr>
                 <w:b/>
               </w:rPr>
-              <w:t xml:space="preserve">Síntesis del video: </w:t>
+              <w:lastRenderedPageBreak/>
+              <w:t>Transcripción del video</w:t>
+            </w:r>
+            <w:r>
+              <w:rPr>
+                <w:b/>
+              </w:rPr>
+              <w:t xml:space="preserve">: </w:t>
             </w:r>
             <w:r>
               <w:t>Introducción a Teams y programación de reuniones</w:t>
@@ -9328,14 +9416,17 @@
           </w:p>
           <w:p>
             <w:r>
+              <w:t xml:space="preserve">Aquí creamos la reunión. Ahorita miramos </w:t>
+            </w:r>
+            <w:r>
+              <w:t xml:space="preserve">aquí en </w:t>
+            </w:r>
+            <w:r>
+              <w:t xml:space="preserve">el tema de las comunidades. Aquí vamos a crear las comunidades. Aquí en calendario podemos ir creando una </w:t>
+            </w:r>
+            <w:r>
               <w:lastRenderedPageBreak/>
-              <w:t xml:space="preserve">Aquí creamos la reunión. Ahorita miramos </w:t>
-            </w:r>
-            <w:r>
-              <w:t xml:space="preserve">aquí en </w:t>
-            </w:r>
-            <w:r>
-              <w:t>el tema de las comunidades. Aquí vamos a crear las comunidades. Aquí en calendario podemos ir creando una agenda de las diferentes reuniones y aquí vamos viendo la actividad que se va generando.</w:t>
+              <w:t>agenda de las diferentes reuniones y aquí vamos viendo la actividad que se va generando.</w:t>
             </w:r>
           </w:p>
           <w:p>
@@ -9389,15 +9480,12 @@
           </w:p>
           <w:p>
             <w:r>
-              <w:t xml:space="preserve">Aquí, si queremos enviar una reacción, por ejemplo: me gusta, me encanta, aplauso. Aquí, si queremos cambiar la vista, por ejemplo, orador o galería, y aquí nos va dando otras opciones: mostrar en galería, desactivar video entrante, ocultarme o </w:t>
-            </w:r>
+              <w:t>Aquí, si queremos enviar una reacción, por ejemplo: me gusta, me encanta, aplauso. Aquí, si queremos cambiar la vista, por ejemplo, orador o galería, y aquí nos va dando otras opciones: mostrar en galería, desactivar video entrante, ocultarme o quitarme de la galería. Entonces, esto lo podemos ir viendo cuando estamos dentro de la reunión.</w:t>
+            </w:r>
+          </w:p>
+          <w:p>
             <w:r>
               <w:lastRenderedPageBreak/>
-              <w:t>quitarme de la galería. Entonces, esto lo podemos ir viendo cuando estamos dentro de la reunión.</w:t>
-            </w:r>
-          </w:p>
-          <w:p>
-            <w:r>
               <w:t>Aquí tenemos información de la reunión. Si queremos configuración y efectos, configuración de audio o idioma. Esto es bueno, por ejemplo, el tema de los idiomas, porque a veces se hace transcripción. Entonces, indicar el idiom</w:t>
             </w:r>
             <w:r>
@@ -9689,7 +9777,7 @@
           </w:tcPr>
           <w:p>
             <w:pPr>
-              <w:jc w:val="center"/>
+              <w:ind w:firstLine="0"/>
               <w:rPr>
                 <w:b/>
               </w:rPr>
@@ -9698,7 +9786,13 @@
               <w:rPr>
                 <w:b/>
               </w:rPr>
-              <w:t xml:space="preserve">Síntesis del video: </w:t>
+              <w:t>Transcripción del video</w:t>
+            </w:r>
+            <w:r>
+              <w:rPr>
+                <w:b/>
+              </w:rPr>
+              <w:t xml:space="preserve">: </w:t>
             </w:r>
             <w:r>
               <w:t>Equipos y canales en Teams.</w:t>
@@ -11725,12 +11819,12 @@
         <w:spacing w:after="120"/>
         <w:ind w:left="720"/>
       </w:pPr>
-      <w:bookmarkStart w:id="12" w:name="_Toc223942475"/>
+      <w:bookmarkStart w:id="13" w:name="_Toc223942475"/>
       <w:r>
         <w:lastRenderedPageBreak/>
         <w:t>SharePoint</w:t>
       </w:r>
-      <w:bookmarkEnd w:id="12"/>
+      <w:bookmarkEnd w:id="13"/>
     </w:p>
     <w:p>
       <w:pPr>
@@ -11803,11 +11897,11 @@
       <w:pPr>
         <w:pStyle w:val="Ttulo2"/>
       </w:pPr>
-      <w:bookmarkStart w:id="13" w:name="_Toc223942476"/>
+      <w:bookmarkStart w:id="14" w:name="_Toc223942476"/>
       <w:r>
         <w:t>Propósito</w:t>
       </w:r>
-      <w:bookmarkEnd w:id="13"/>
+      <w:bookmarkEnd w:id="14"/>
     </w:p>
     <w:p>
       <w:pPr>
@@ -11914,11 +12008,11 @@
       <w:pPr>
         <w:pStyle w:val="Ttulo2"/>
       </w:pPr>
-      <w:bookmarkStart w:id="14" w:name="_Toc223942477"/>
+      <w:bookmarkStart w:id="15" w:name="_Toc223942477"/>
       <w:r>
         <w:t>Diferencias con OneDrive</w:t>
       </w:r>
-      <w:bookmarkEnd w:id="14"/>
+      <w:bookmarkEnd w:id="15"/>
     </w:p>
     <w:p>
       <w:pPr>
@@ -12014,11 +12108,11 @@
       <w:pPr>
         <w:pStyle w:val="Ttulo2"/>
       </w:pPr>
-      <w:bookmarkStart w:id="15" w:name="_Toc223942478"/>
+      <w:bookmarkStart w:id="16" w:name="_Toc223942478"/>
       <w:r>
         <w:t>Organización de archivos en espacios compartidos</w:t>
       </w:r>
-      <w:bookmarkEnd w:id="15"/>
+      <w:bookmarkEnd w:id="16"/>
     </w:p>
     <w:p>
       <w:pPr>
@@ -12435,11 +12529,11 @@
       <w:pPr>
         <w:pStyle w:val="Ttulo2"/>
       </w:pPr>
-      <w:bookmarkStart w:id="16" w:name="_Toc223942479"/>
+      <w:bookmarkStart w:id="17" w:name="_Toc223942479"/>
       <w:r>
         <w:t>Acceso y permisos de usuarios</w:t>
       </w:r>
-      <w:bookmarkEnd w:id="16"/>
+      <w:bookmarkEnd w:id="17"/>
     </w:p>
     <w:p>
       <w:pPr>
@@ -12933,12 +13027,12 @@
       <w:pPr>
         <w:pStyle w:val="Titulosgenerales"/>
       </w:pPr>
-      <w:bookmarkStart w:id="17" w:name="_Toc223942480"/>
+      <w:bookmarkStart w:id="18" w:name="_Toc223942480"/>
       <w:r>
         <w:lastRenderedPageBreak/>
         <w:t>Síntesis</w:t>
       </w:r>
-      <w:bookmarkEnd w:id="17"/>
+      <w:bookmarkEnd w:id="18"/>
     </w:p>
     <w:p>
       <w:pPr>
@@ -13011,14 +13105,14 @@
       <w:pPr>
         <w:pStyle w:val="Titulosgenerales"/>
       </w:pPr>
-      <w:bookmarkStart w:id="18" w:name="_Toc176443725"/>
-      <w:bookmarkStart w:id="19" w:name="_Toc223942481"/>
+      <w:bookmarkStart w:id="19" w:name="_Toc176443725"/>
+      <w:bookmarkStart w:id="20" w:name="_Toc223942481"/>
       <w:r>
         <w:lastRenderedPageBreak/>
         <w:t>Glosario</w:t>
       </w:r>
-      <w:bookmarkEnd w:id="18"/>
       <w:bookmarkEnd w:id="19"/>
+      <w:bookmarkEnd w:id="20"/>
     </w:p>
     <w:p>
       <w:pPr>
@@ -13363,8 +13457,8 @@
           <w:lang w:val="es-MX"/>
         </w:rPr>
       </w:pPr>
-      <w:bookmarkStart w:id="20" w:name="_Toc176443726"/>
-      <w:bookmarkStart w:id="21" w:name="_Toc223942482"/>
+      <w:bookmarkStart w:id="21" w:name="_Toc176443726"/>
+      <w:bookmarkStart w:id="22" w:name="_Toc223942482"/>
       <w:r>
         <w:rPr>
           <w:lang w:val="es-MX"/>
@@ -13372,8 +13466,8 @@
         <w:lastRenderedPageBreak/>
         <w:t>Referencias bibliográficas</w:t>
       </w:r>
-      <w:bookmarkEnd w:id="20"/>
       <w:bookmarkEnd w:id="21"/>
+      <w:bookmarkEnd w:id="22"/>
     </w:p>
     <w:p>
       <w:pPr>
@@ -13727,14 +13821,14 @@
       <w:pPr>
         <w:pStyle w:val="Titulosgenerales"/>
       </w:pPr>
-      <w:bookmarkStart w:id="22" w:name="_Toc176443727"/>
-      <w:bookmarkStart w:id="23" w:name="_Toc223942483"/>
+      <w:bookmarkStart w:id="23" w:name="_Toc176443727"/>
+      <w:bookmarkStart w:id="24" w:name="_Toc223942483"/>
       <w:r>
         <w:lastRenderedPageBreak/>
         <w:t>Créditos</w:t>
       </w:r>
-      <w:bookmarkEnd w:id="22"/>
       <w:bookmarkEnd w:id="23"/>
+      <w:bookmarkEnd w:id="24"/>
     </w:p>
     <w:tbl>
       <w:tblPr>
@@ -14426,8 +14520,6 @@
             <w:r>
               <w:t xml:space="preserve">Evaluadora de </w:t>
             </w:r>
-            <w:bookmarkStart w:id="24" w:name="_GoBack"/>
-            <w:bookmarkEnd w:id="24"/>
             <w:r>
               <w:t>contenidos inclusivos y accesibles</w:t>
             </w:r>
@@ -14642,7 +14734,7 @@
         <w:noProof/>
         <w:lang w:val="es-ES"/>
       </w:rPr>
-      <w:t>51</w:t>
+      <w:t>21</w:t>
     </w:r>
     <w:r>
       <w:fldChar w:fldCharType="end"/>
@@ -17754,6 +17846,18 @@
     <w:basedOn w:val="Fuentedeprrafopredeter"/>
     <w:rsid w:val="00DC0A1F"/>
   </w:style>
+  <w:style w:type="character" w:styleId="Hipervnculovisitado">
+    <w:name w:val="FollowedHyperlink"/>
+    <w:basedOn w:val="Fuentedeprrafopredeter"/>
+    <w:uiPriority w:val="99"/>
+    <w:semiHidden/>
+    <w:unhideWhenUsed/>
+    <w:rsid w:val="0069047A"/>
+    <w:rPr>
+      <w:color w:val="954F72" w:themeColor="followedHyperlink"/>
+      <w:u w:val="single"/>
+    </w:rPr>
+  </w:style>
 </w:styles>
 </file>
 
@@ -18053,17 +18157,6 @@
 </file>
 
 <file path=customXml/item1.xml><?xml version="1.0" encoding="utf-8"?>
-<p:properties xmlns:p="http://schemas.microsoft.com/office/2006/metadata/properties" xmlns:xsi="http://www.w3.org/2001/XMLSchema-instance" xmlns:pc="http://schemas.microsoft.com/office/infopath/2007/PartnerControls">
-  <documentManagement>
-    <TaxCatchAll xmlns="285d351f-f218-493a-825f-85a9dfbde315" xsi:nil="true"/>
-    <lcf76f155ced4ddcb4097134ff3c332f xmlns="55abea07-cd72-4a95-add0-1082a24cf9e9">
-      <Terms xmlns="http://schemas.microsoft.com/office/infopath/2007/PartnerControls"/>
-    </lcf76f155ced4ddcb4097134ff3c332f>
-  </documentManagement>
-</p:properties>
-</file>
-
-<file path=customXml/item2.xml><?xml version="1.0" encoding="utf-8"?>
 <ct:contentTypeSchema xmlns:ct="http://schemas.microsoft.com/office/2006/metadata/contentType" xmlns:ma="http://schemas.microsoft.com/office/2006/metadata/properties/metaAttributes" ct:_="" ma:_="" ma:contentTypeName="Documento" ma:contentTypeID="0x0101005D7421CBAB376F47AC1876466873BE0C" ma:contentTypeVersion="11" ma:contentTypeDescription="Crear nuevo documento." ma:contentTypeScope="" ma:versionID="f360f8b6fb6f4c8bd21c6a7e407e2e16">
   <xsd:schema xmlns:xsd="http://www.w3.org/2001/XMLSchema" xmlns:xs="http://www.w3.org/2001/XMLSchema" xmlns:p="http://schemas.microsoft.com/office/2006/metadata/properties" xmlns:ns2="55abea07-cd72-4a95-add0-1082a24cf9e9" xmlns:ns3="285d351f-f218-493a-825f-85a9dfbde315" targetNamespace="http://schemas.microsoft.com/office/2006/metadata/properties" ma:root="true" ma:fieldsID="45e32b76c8e436055369618aac27ad35" ns2:_="" ns3:_="">
     <xsd:import namespace="55abea07-cd72-4a95-add0-1082a24cf9e9"/>
@@ -18258,7 +18351,7 @@
 </ct:contentTypeSchema>
 </file>
 
-<file path=customXml/item3.xml><?xml version="1.0" encoding="utf-8"?>
+<file path=customXml/item2.xml><?xml version="1.0" encoding="utf-8"?>
 <?mso-contentType ?>
 <FormTemplates xmlns="http://schemas.microsoft.com/sharepoint/v3/contenttype/forms">
   <Display>DocumentLibraryForm</Display>
@@ -18267,11 +18360,34 @@
 </FormTemplates>
 </file>
 
+<file path=customXml/item3.xml><?xml version="1.0" encoding="utf-8"?>
+<p:properties xmlns:p="http://schemas.microsoft.com/office/2006/metadata/properties" xmlns:xsi="http://www.w3.org/2001/XMLSchema-instance" xmlns:pc="http://schemas.microsoft.com/office/infopath/2007/PartnerControls">
+  <documentManagement>
+    <TaxCatchAll xmlns="285d351f-f218-493a-825f-85a9dfbde315" xsi:nil="true"/>
+    <lcf76f155ced4ddcb4097134ff3c332f xmlns="55abea07-cd72-4a95-add0-1082a24cf9e9">
+      <Terms xmlns="http://schemas.microsoft.com/office/infopath/2007/PartnerControls"/>
+    </lcf76f155ced4ddcb4097134ff3c332f>
+  </documentManagement>
+</p:properties>
+</file>
+
 <file path=customXml/item4.xml><?xml version="1.0" encoding="utf-8"?>
 <b:Sources xmlns:b="http://schemas.openxmlformats.org/officeDocument/2006/bibliography" xmlns="http://schemas.openxmlformats.org/officeDocument/2006/bibliography" SelectedStyle="\APASixthEditionOfficeOnline.xsl" StyleName="APA" Version="6"/>
 </file>
 
 <file path=customXml/itemProps1.xml><?xml version="1.0" encoding="utf-8"?>
+<ds:datastoreItem xmlns:ds="http://schemas.openxmlformats.org/officeDocument/2006/customXml" ds:itemID="{55AF8C98-ABCB-48A6-BAAA-326D89EAF9C5}"/>
+</file>
+
+<file path=customXml/itemProps2.xml><?xml version="1.0" encoding="utf-8"?>
+<ds:datastoreItem xmlns:ds="http://schemas.openxmlformats.org/officeDocument/2006/customXml" ds:itemID="{91756AAB-0645-4FFC-990B-34BB6096B23B}">
+  <ds:schemaRefs>
+    <ds:schemaRef ds:uri="http://schemas.microsoft.com/sharepoint/v3/contenttype/forms"/>
+  </ds:schemaRefs>
+</ds:datastoreItem>
+</file>
+
+<file path=customXml/itemProps3.xml><?xml version="1.0" encoding="utf-8"?>
 <ds:datastoreItem xmlns:ds="http://schemas.openxmlformats.org/officeDocument/2006/customXml" ds:itemID="{CEECB56F-E1D8-45BF-A0A3-B5258E7263D4}">
   <ds:schemaRefs>
     <ds:schemaRef ds:uri="http://schemas.microsoft.com/office/2006/metadata/properties"/>
@@ -18282,20 +18398,8 @@
 </ds:datastoreItem>
 </file>
 
-<file path=customXml/itemProps2.xml><?xml version="1.0" encoding="utf-8"?>
-<ds:datastoreItem xmlns:ds="http://schemas.openxmlformats.org/officeDocument/2006/customXml" ds:itemID="{CBFD772D-98D8-4CED-8B6A-937348A2E8D2}"/>
-</file>
-
-<file path=customXml/itemProps3.xml><?xml version="1.0" encoding="utf-8"?>
-<ds:datastoreItem xmlns:ds="http://schemas.openxmlformats.org/officeDocument/2006/customXml" ds:itemID="{91756AAB-0645-4FFC-990B-34BB6096B23B}">
-  <ds:schemaRefs>
-    <ds:schemaRef ds:uri="http://schemas.microsoft.com/sharepoint/v3/contenttype/forms"/>
-  </ds:schemaRefs>
-</ds:datastoreItem>
-</file>
-
 <file path=customXml/itemProps4.xml><?xml version="1.0" encoding="utf-8"?>
-<ds:datastoreItem xmlns:ds="http://schemas.openxmlformats.org/officeDocument/2006/customXml" ds:itemID="{9D20B51E-0B9F-4C78-8D0F-DADA33FAFCF9}">
+<ds:datastoreItem xmlns:ds="http://schemas.openxmlformats.org/officeDocument/2006/customXml" ds:itemID="{AF191B8D-471B-46CE-B872-36AE97912DAA}">
   <ds:schemaRefs>
     <ds:schemaRef ds:uri="http://schemas.openxmlformats.org/officeDocument/2006/bibliography"/>
   </ds:schemaRefs>

</xml_diff>